<commit_message>
Brand TRA with logo across product, SOW, and GTM assets
Add logo to web nav/login/home, favicon and Open Graph; regenerate pilot
SOW with header lockup; LinkedIn 1584x396 banner; Denver prospect queue
and 90-day revenue plan docs.
</commit_message>
<xml_diff>
--- a/go-to-market/TRA-Design-Partner-Pilot-SOW.docx
+++ b/go-to-market/TRA-Design-Partner-Pilot-SOW.docx
@@ -1972,20 +1972,120 @@
 
 <file path=word/header1.xml><?xml version="1.0" encoding="utf-8"?>
 <w:hdr xmlns:wpc="http://schemas.microsoft.com/office/word/2010/wordprocessingCanvas" xmlns:mc="http://schemas.openxmlformats.org/markup-compatibility/2006" xmlns:o="urn:schemas-microsoft-com:office:office" xmlns:r="http://schemas.openxmlformats.org/officeDocument/2006/relationships" xmlns:m="http://schemas.openxmlformats.org/officeDocument/2006/math" xmlns:v="urn:schemas-microsoft-com:vml" xmlns:wp14="http://schemas.microsoft.com/office/word/2010/wordprocessingDrawing" xmlns:wp="http://schemas.openxmlformats.org/drawingml/2006/wordprocessingDrawing" xmlns:w10="urn:schemas-microsoft-com:office:word" xmlns:w="http://schemas.openxmlformats.org/wordprocessingml/2006/main" xmlns:w14="http://schemas.microsoft.com/office/word/2010/wordml" xmlns:w15="http://schemas.microsoft.com/office/word/2012/wordml" xmlns:wpg="http://schemas.microsoft.com/office/word/2010/wordprocessingGroup" xmlns:wpi="http://schemas.microsoft.com/office/word/2010/wordprocessingInk" xmlns:wne="http://schemas.microsoft.com/office/word/2006/wordml" xmlns:wps="http://schemas.microsoft.com/office/word/2010/wordprocessingShape" xmlns:cx="http://schemas.microsoft.com/office/drawing/2014/chartex" xmlns:cx1="http://schemas.microsoft.com/office/drawing/2015/9/8/chartex" xmlns:cx2="http://schemas.microsoft.com/office/drawing/2015/10/21/chartex" xmlns:cx3="http://schemas.microsoft.com/office/drawing/2016/5/9/chartex" xmlns:cx4="http://schemas.microsoft.com/office/drawing/2016/5/10/chartex" xmlns:cx5="http://schemas.microsoft.com/office/drawing/2016/5/11/chartex" xmlns:cx6="http://schemas.microsoft.com/office/drawing/2016/5/12/chartex" xmlns:cx7="http://schemas.microsoft.com/office/drawing/2016/5/13/chartex" xmlns:cx8="http://schemas.microsoft.com/office/drawing/2016/5/14/chartex" xmlns:w16cid="http://schemas.microsoft.com/office/word/2016/wordml/cid" xmlns:w16se="http://schemas.microsoft.com/office/word/2015/wordml/symex">
-  <w:p>
-    <w:pPr>
-      <w:jc w:val="right"/>
-    </w:pPr>
-    <w:r>
-      <w:rPr>
-        <w:rFonts w:ascii="Arial" w:cs="Arial" w:eastAsia="Arial" w:hAnsi="Arial"/>
-        <w:color w:val="64748B"/>
-        <w:sz w:val="14"/>
-        <w:szCs w:val="14"/>
-      </w:rPr>
-      <w:t xml:space="preserve">Total Rewards Accelerator v0.3  ·  Design Partner Pilot SOW</w:t>
-    </w:r>
-  </w:p>
+  <w:tbl>
+    <w:tblPr>
+      <w:tblW w:type="dxa" w:w="10880"/>
+      <w:tblBorders>
+        <w:top w:val="single" w:color="auto" w:sz="4"/>
+        <w:left w:val="single" w:color="auto" w:sz="4"/>
+        <w:bottom w:val="single" w:color="auto" w:sz="4"/>
+        <w:right w:val="single" w:color="auto" w:sz="4"/>
+        <w:insideH w:val="single" w:color="auto" w:sz="4"/>
+        <w:insideV w:val="single" w:color="auto" w:sz="4"/>
+      </w:tblBorders>
+    </w:tblPr>
+    <w:tblGrid>
+      <w:gridCol w:w="3200"/>
+      <w:gridCol w:w="7680"/>
+    </w:tblGrid>
+    <w:tr>
+      <w:tc>
+        <w:tcPr>
+          <w:tcW w:type="dxa" w:w="3200"/>
+          <w:tcBorders>
+            <w:top w:val="none" w:color="FFFFFF" w:sz="0"/>
+            <w:left w:val="none" w:color="FFFFFF" w:sz="0"/>
+            <w:bottom w:val="none" w:color="FFFFFF" w:sz="0"/>
+            <w:right w:val="none" w:color="FFFFFF" w:sz="0"/>
+          </w:tcBorders>
+        </w:tcPr>
+        <w:p>
+          <w:r>
+            <w:drawing>
+              <wp:inline distT="0" distB="0" distL="0" distR="0">
+                <wp:extent cx="1524000" cy="828675"/>
+                <wp:effectExtent t="0" r="0" b="0" l="0"/>
+                <wp:docPr id="1" name="TRA logo" descr="Total Rewards Accelerator logo" title="Total Rewards Accelerator"/>
+                <wp:cNvGraphicFramePr>
+                  <a:graphicFrameLocks xmlns:a="http://schemas.openxmlformats.org/drawingml/2006/main" noChangeAspect="1"/>
+                </wp:cNvGraphicFramePr>
+                <a:graphic xmlns:a="http://schemas.openxmlformats.org/drawingml/2006/main">
+                  <a:graphicData uri="http://schemas.openxmlformats.org/drawingml/2006/picture">
+                    <pic:pic xmlns:pic="http://schemas.openxmlformats.org/drawingml/2006/picture">
+                      <pic:nvPicPr>
+                        <pic:cNvPr id="0" name="" descr=""/>
+                        <pic:cNvPicPr>
+                          <a:picLocks noChangeAspect="1" noChangeArrowheads="1"/>
+                        </pic:cNvPicPr>
+                      </pic:nvPicPr>
+                      <pic:blipFill>
+                        <a:blip r:embed="rId0" cstate="none"/>
+                        <a:srcRect/>
+                        <a:stretch>
+                          <a:fillRect/>
+                        </a:stretch>
+                      </pic:blipFill>
+                      <pic:spPr bwMode="auto">
+                        <a:xfrm>
+                          <a:off x="0" y="0"/>
+                          <a:ext cx="1524000" cy="828675"/>
+                        </a:xfrm>
+                        <a:prstGeom prst="rect">
+                          <a:avLst/>
+                        </a:prstGeom>
+                      </pic:spPr>
+                    </pic:pic>
+                  </a:graphicData>
+                </a:graphic>
+              </wp:inline>
+            </w:drawing>
+          </w:r>
+        </w:p>
+      </w:tc>
+      <w:tc>
+        <w:tcPr>
+          <w:tcW w:type="dxa" w:w="7680"/>
+          <w:tcBorders>
+            <w:top w:val="none" w:color="FFFFFF" w:sz="0"/>
+            <w:left w:val="none" w:color="FFFFFF" w:sz="0"/>
+            <w:bottom w:val="none" w:color="FFFFFF" w:sz="0"/>
+            <w:right w:val="none" w:color="FFFFFF" w:sz="0"/>
+          </w:tcBorders>
+          <w:vAlign w:val="center"/>
+        </w:tcPr>
+        <w:p>
+          <w:pPr>
+            <w:jc w:val="right"/>
+          </w:pPr>
+          <w:r>
+            <w:rPr>
+              <w:rFonts w:ascii="Arial" w:cs="Arial" w:eastAsia="Arial" w:hAnsi="Arial"/>
+              <w:color w:val="64748B"/>
+              <w:sz w:val="14"/>
+              <w:szCs w:val="14"/>
+            </w:rPr>
+            <w:t xml:space="preserve">Design Partner Pilot SOW  ·  v0.3</w:t>
+          </w:r>
+        </w:p>
+        <w:p>
+          <w:pPr>
+            <w:jc w:val="right"/>
+          </w:pPr>
+          <w:r>
+            <w:rPr>
+              <w:rFonts w:ascii="Arial" w:cs="Arial" w:eastAsia="Arial" w:hAnsi="Arial"/>
+              <w:i/>
+              <w:iCs/>
+              <w:color w:val="0F6B6D"/>
+              <w:sz w:val="12"/>
+              <w:szCs w:val="12"/>
+            </w:rPr>
+            <w:t xml:space="preserve">Making compensation easy</w:t>
+          </w:r>
+        </w:p>
+      </w:tc>
+    </w:tr>
+  </w:tbl>
 </w:hdr>
 </file>
 

</xml_diff>